<commit_message>
docs: address Week 2 gap analysis, add primer one-liner, freshness SLA, failure mode analysis, Google Doc submission guide, and set author to Jayanth Malipeddy
</commit_message>
<xml_diff>
--- a/docs/ReguGraph_UAE_Project_Specification_and_Explanation.docx
+++ b/docs/ReguGraph_UAE_Project_Specification_and_Explanation.docx
@@ -181,7 +181,7 @@
                 <w:color w:val="0F172A"/>
                 <w:sz w:val="19"/>
               </w:rPr>
-              <w:t>Lead System Architect:</w:t>
+              <w:t>Lead System Architect &amp; Author:</w:t>
             </w:r>
           </w:p>
         </w:tc>
@@ -200,7 +200,7 @@
                 <w:color w:val="334155"/>
                 <w:sz w:val="19"/>
               </w:rPr>
-              <w:t>AI Engineering &amp; RegTech Practice</w:t>
+              <w:t>Jayanth Malipeddy</w:t>
             </w:r>
           </w:p>
         </w:tc>

</xml_diff>